<commit_message>
Regenerate all reports strictly in formal B&W academic style (Times New Roman, no AI styling)
</commit_message>
<xml_diff>
--- a/reports/ПЗ_2_Отчет_Сайт_университета_Создание_проекта.docx
+++ b/reports/ПЗ_2_Отчет_Сайт_университета_Создание_проекта.docx
@@ -8,9 +8,41 @@
       </w:pPr>
       <w:r>
         <w:rPr>
+          <w:rFonts w:ascii="Times New Roman" w:hAnsi="Times New Roman"/>
+          <w:color w:val="000000"/>
+          <w:sz w:val="20"/>
+        </w:rPr>
+        <w:t>МИНИСТЕРСТВО НАУКИ И ВЫСШЕГО ОБРАЗОВАНИЯ РОССИЙСКОЙ ФЕДЕРАЦИИ</w:t>
+      </w:r>
+    </w:p>
+    <w:p>
+      <w:pPr>
+        <w:jc w:val="center"/>
+      </w:pPr>
+      <w:r>
+        <w:rPr>
+          <w:rFonts w:ascii="Times New Roman" w:hAnsi="Times New Roman"/>
+          <w:color w:val="000000"/>
+          <w:sz w:val="20"/>
+        </w:rPr>
+        <w:t>Кафедра информационных систем и технологий</w:t>
+      </w:r>
+    </w:p>
+    <w:p>
+      <w:pPr>
+        <w:spacing w:after="360"/>
+      </w:pPr>
+    </w:p>
+    <w:p>
+      <w:pPr>
+        <w:jc w:val="center"/>
+      </w:pPr>
+      <w:r>
+        <w:rPr>
+          <w:rFonts w:ascii="Times New Roman" w:hAnsi="Times New Roman"/>
           <w:b/>
-          <w:color w:val="1B365D"/>
-          <w:sz w:val="32"/>
+          <w:color w:val="000000"/>
+          <w:sz w:val="28"/>
         </w:rPr>
         <w:t>ОТЧЕТ ПО ПРАКТИЧЕСКОЙ РАБОТЕ № 2</w:t>
       </w:r>
@@ -21,180 +53,186 @@
       </w:pPr>
       <w:r>
         <w:rPr>
+          <w:rFonts w:ascii="Times New Roman" w:hAnsi="Times New Roman"/>
           <w:b/>
-          <w:color w:val="333333"/>
-          <w:sz w:val="26"/>
+          <w:color w:val="000000"/>
+          <w:sz w:val="24"/>
         </w:rPr>
-        <w:t>Тема: «Сайт университета. Создание базового проекта и приложения»</w:t>
+        <w:t>Тема: «Сайт университета. Создание проекта и приложения»</w:t>
       </w:r>
     </w:p>
     <w:p>
       <w:pPr>
-        <w:jc w:val="center"/>
+        <w:spacing w:before="360" w:after="480"/>
+        <w:jc w:val="right"/>
       </w:pPr>
       <w:r>
         <w:rPr>
-          <w:i/>
-          <w:color w:val="555555"/>
-          <w:sz w:val="20"/>
+          <w:rFonts w:ascii="Times New Roman" w:hAnsi="Times New Roman"/>
+          <w:color w:val="000000"/>
+          <w:sz w:val="22"/>
         </w:rPr>
-        <w:t>Дисциплина: «Веб-разработка» | Проект: «hogwarts»</w:t>
+        <w:t>Дисциплина: Веб-разработка</w:t>
         <w:br/>
-        <w:t>Студент: Храмов | Год: 2026</w:t>
+        <w:t>Выполнил: студент Храмов</w:t>
         <w:br/>
+        <w:t>Проект: hogwarts</w:t>
+        <w:br/>
+        <w:t>Год: 2026</w:t>
       </w:r>
     </w:p>
     <w:p>
       <w:pPr>
-        <w:spacing w:before="240" w:after="80"/>
+        <w:spacing w:before="280" w:after="80"/>
+        <w:ind w:firstLine="0"/>
       </w:pPr>
       <w:r>
         <w:rPr>
+          <w:rFonts w:ascii="Times New Roman" w:hAnsi="Times New Roman"/>
           <w:b/>
-          <w:color w:val="1B365D"/>
+          <w:color w:val="000000"/>
           <w:sz w:val="26"/>
         </w:rPr>
         <w:t>1. Цель работы</w:t>
       </w:r>
     </w:p>
     <w:p>
+      <w:pPr>
+        <w:ind w:firstLine="706"/>
+        <w:jc w:val="both"/>
+      </w:pPr>
       <w:r>
-        <w:t>Изучение структуры веб-фреймворка Django, освоение команд управления django-admin и manage.py, создание нового проекта, регистрация администратора (суперпользователя), создание и подключение Django-приложения, настройка URL-маршрутизации с использованием include() и RedirectView, а также реализация функции представления index().</w:t>
+        <w:rPr>
+          <w:rFonts w:ascii="Times New Roman" w:hAnsi="Times New Roman"/>
+          <w:color w:val="000000"/>
+          <w:sz w:val="24"/>
+        </w:rPr>
+        <w:t>Изучение структуры веб-фреймворка Django, команд утилиты manage.py, создание базового проекта, регистрация учетной записи суперпользователя, создание и подключение приложения students, настройка URL-маршрутизации с применением include() и RedirectView, а также реализация функции представления index().</w:t>
       </w:r>
     </w:p>
     <w:p>
       <w:pPr>
-        <w:spacing w:before="240" w:after="80"/>
+        <w:spacing w:before="280" w:after="80"/>
+        <w:ind w:firstLine="0"/>
       </w:pPr>
       <w:r>
         <w:rPr>
+          <w:rFonts w:ascii="Times New Roman" w:hAnsi="Times New Roman"/>
           <w:b/>
-          <w:color w:val="1B365D"/>
+          <w:color w:val="000000"/>
           <w:sz w:val="26"/>
         </w:rPr>
-        <w:t>2. Задачи работы</w:t>
+        <w:t>2. Задание к работе</w:t>
       </w:r>
     </w:p>
     <w:p>
       <w:pPr>
-        <w:pStyle w:val="ListBullet"/>
+        <w:ind w:firstLine="706"/>
+        <w:jc w:val="both"/>
       </w:pPr>
       <w:r>
         <w:rPr>
-          <w:b/>
+          <w:rFonts w:ascii="Times New Roman" w:hAnsi="Times New Roman"/>
+          <w:color w:val="000000"/>
+          <w:sz w:val="24"/>
         </w:rPr>
-        <w:t xml:space="preserve">1. </w:t>
-      </w:r>
-      <w:r>
-        <w:t>Создать проект Django с названием университета («hogwarts» — Школа Чародейства и Волшебства Хогвартс).</w:t>
+        <w:t>1. Создать проект Django с названием hogwarts.</w:t>
       </w:r>
     </w:p>
     <w:p>
       <w:pPr>
-        <w:pStyle w:val="ListBullet"/>
+        <w:ind w:firstLine="706"/>
+        <w:jc w:val="both"/>
       </w:pPr>
       <w:r>
         <w:rPr>
-          <w:b/>
+          <w:rFonts w:ascii="Times New Roman" w:hAnsi="Times New Roman"/>
+          <w:color w:val="000000"/>
+          <w:sz w:val="24"/>
         </w:rPr>
-        <w:t xml:space="preserve">2. </w:t>
-      </w:r>
-      <w:r>
-        <w:t>Проверить корректность запуска сервера и отображение приветственной страницы фреймворка.</w:t>
+        <w:t>2. Проверить запуск веб-сервера разработки.</w:t>
       </w:r>
     </w:p>
     <w:p>
       <w:pPr>
-        <w:pStyle w:val="ListBullet"/>
+        <w:ind w:firstLine="706"/>
+        <w:jc w:val="both"/>
       </w:pPr>
       <w:r>
         <w:rPr>
-          <w:b/>
+          <w:rFonts w:ascii="Times New Roman" w:hAnsi="Times New Roman"/>
+          <w:color w:val="000000"/>
+          <w:sz w:val="24"/>
         </w:rPr>
-        <w:t xml:space="preserve">3. </w:t>
-      </w:r>
-      <w:r>
-        <w:t>Создать учетную запись суперпользователя и протестировать вход в панель администрирования Django (/admin/).</w:t>
+        <w:t>3. Создать аккаунт администратора командой createsuperuser и проверить доступ к /admin/.</w:t>
       </w:r>
     </w:p>
     <w:p>
       <w:pPr>
-        <w:pStyle w:val="ListBullet"/>
+        <w:ind w:firstLine="706"/>
+        <w:jc w:val="both"/>
       </w:pPr>
       <w:r>
         <w:rPr>
-          <w:b/>
+          <w:rFonts w:ascii="Times New Roman" w:hAnsi="Times New Roman"/>
+          <w:color w:val="000000"/>
+          <w:sz w:val="24"/>
         </w:rPr>
-        <w:t xml:space="preserve">4. </w:t>
-      </w:r>
-      <w:r>
-        <w:t>Создать приложение для ведения студенческой базы (students).</w:t>
+        <w:t>4. Создать приложение студенческой базы students.</w:t>
       </w:r>
     </w:p>
     <w:p>
       <w:pPr>
-        <w:pStyle w:val="ListBullet"/>
+        <w:ind w:firstLine="706"/>
+        <w:jc w:val="both"/>
       </w:pPr>
       <w:r>
         <w:rPr>
-          <w:b/>
+          <w:rFonts w:ascii="Times New Roman" w:hAnsi="Times New Roman"/>
+          <w:color w:val="000000"/>
+          <w:sz w:val="24"/>
         </w:rPr>
-        <w:t xml:space="preserve">5. </w:t>
-      </w:r>
-      <w:r>
-        <w:t>Зарегистрировать приложение в списке INSTALLED_APPS в settings.py.</w:t>
+        <w:t>5. Добавить приложение в INSTALLED_APPS файла settings.py.</w:t>
       </w:r>
     </w:p>
     <w:p>
       <w:pPr>
-        <w:pStyle w:val="ListBullet"/>
+        <w:ind w:firstLine="706"/>
+        <w:jc w:val="both"/>
       </w:pPr>
       <w:r>
         <w:rPr>
-          <w:b/>
+          <w:rFonts w:ascii="Times New Roman" w:hAnsi="Times New Roman"/>
+          <w:color w:val="000000"/>
+          <w:sz w:val="24"/>
         </w:rPr>
-        <w:t xml:space="preserve">6. </w:t>
-      </w:r>
-      <w:r>
-        <w:t>Настроить маршрутизацию в файле hogwarts/urls.py с перенаправлением с корневого URL на адрес приложения через RedirectView.</w:t>
+        <w:t>6. Настроить перенаправление с корневого адреса / на адрес приложения через RedirectView.</w:t>
       </w:r>
     </w:p>
     <w:p>
       <w:pPr>
-        <w:pStyle w:val="ListBullet"/>
+        <w:ind w:firstLine="706"/>
+        <w:jc w:val="both"/>
       </w:pPr>
       <w:r>
         <w:rPr>
-          <w:b/>
+          <w:rFonts w:ascii="Times New Roman" w:hAnsi="Times New Roman"/>
+          <w:color w:val="000000"/>
+          <w:sz w:val="24"/>
         </w:rPr>
-        <w:t xml:space="preserve">7. </w:t>
-      </w:r>
-      <w:r>
-        <w:t>Создать функцию представления index в students/views.py и связать ее с маршрутом в students/urls.py.</w:t>
+        <w:t>7. Реализовать функцию index() в students/views.py и связать ее с маршрутом.</w:t>
       </w:r>
     </w:p>
     <w:p>
       <w:pPr>
-        <w:pStyle w:val="ListBullet"/>
+        <w:spacing w:before="280" w:after="80"/>
+        <w:ind w:firstLine="0"/>
       </w:pPr>
       <w:r>
         <w:rPr>
+          <w:rFonts w:ascii="Times New Roman" w:hAnsi="Times New Roman"/>
           <w:b/>
-        </w:rPr>
-        <w:t xml:space="preserve">8. </w:t>
-      </w:r>
-      <w:r>
-        <w:t>Проверить отображение стартовой страницы сайта университета.</w:t>
-      </w:r>
-    </w:p>
-    <w:p>
-      <w:pPr>
-        <w:spacing w:before="240" w:after="80"/>
-      </w:pPr>
-      <w:r>
-        <w:rPr>
-          <w:b/>
-          <w:color w:val="1B365D"/>
+          <w:color w:val="000000"/>
           <w:sz w:val="26"/>
         </w:rPr>
         <w:t>3. Ход выполнения работы</w:t>
@@ -202,53 +240,63 @@
     </w:p>
     <w:p>
       <w:pPr>
-        <w:spacing w:before="160" w:after="40"/>
+        <w:ind w:firstLine="706"/>
+        <w:jc w:val="both"/>
       </w:pPr>
       <w:r>
         <w:rPr>
-          <w:b/>
-          <w:color w:val="2B547E"/>
-          <w:sz w:val="23"/>
+          <w:rFonts w:ascii="Times New Roman" w:hAnsi="Times New Roman"/>
+          <w:color w:val="000000"/>
+          <w:sz w:val="24"/>
         </w:rPr>
-        <w:t>3.1. Создание проекта и приложения</w:t>
+        <w:t>Инициализация проекта и приложения выполнена стандартными командами Django:</w:t>
       </w:r>
     </w:p>
     <w:p>
+      <w:pPr>
+        <w:spacing w:after="40"/>
+        <w:ind w:firstLine="706"/>
+      </w:pPr>
       <w:r>
-        <w:t>Для создания проекта и приложения использовались консольные команды Django:</w:t>
+        <w:rPr>
+          <w:rFonts w:ascii="Times New Roman" w:hAnsi="Times New Roman"/>
+          <w:i/>
+          <w:color w:val="000000"/>
+          <w:sz w:val="21"/>
+        </w:rPr>
+        <w:t>Листинг 1 — Команды терминала</w:t>
       </w:r>
     </w:p>
     <w:tbl>
       <w:tblPr>
         <w:tblW w:type="auto" w:w="0"/>
         <w:jc w:val="center"/>
-        <w:tblLayout w:type="fixed"/>
         <w:tblLook w:firstColumn="1" w:firstRow="1" w:lastColumn="0" w:lastRow="0" w:noHBand="0" w:noVBand="1" w:val="04A0"/>
       </w:tblPr>
       <w:tblGrid>
-        <w:gridCol w:w="9706"/>
+        <w:gridCol w:w="9691"/>
       </w:tblGrid>
       <w:tr>
         <w:tc>
           <w:tcPr>
-            <w:tcW w:type="dxa" w:w="9792"/>
-            <w:shd w:fill="F4F5F7"/>
+            <w:tcW w:type="dxa" w:w="9360"/>
           </w:tcPr>
           <w:p>
             <w:pPr>
               <w:spacing w:before="40" w:after="40" w:line="240" w:lineRule="auto"/>
+              <w:ind w:firstLine="0"/>
             </w:pPr>
             <w:r>
               <w:rPr>
-                <w:rFonts w:ascii="Consolas" w:hAnsi="Consolas"/>
-                <w:color w:val="24292E"/>
-                <w:sz w:val="17"/>
+                <w:rFonts w:ascii="Courier New" w:hAnsi="Courier New"/>
+                <w:color w:val="000000"/>
+                <w:sz w:val="19"/>
               </w:rPr>
               <w:t>django-admin startproject hogwarts .</w:t>
               <w:br/>
               <w:t>py manage.py migrate</w:t>
               <w:br/>
-              <w:t>py manage.py createsuperuser --username admin --email admin@hogwarts.edu</w:t>
+              <w:t>py manage.py createsuperuser</w:t>
               <w:br/>
               <w:t>py manage.py startapp students</w:t>
             </w:r>
@@ -263,42 +311,57 @@
     </w:p>
     <w:p>
       <w:pPr>
-        <w:spacing w:before="160" w:after="40"/>
+        <w:ind w:firstLine="706"/>
+        <w:jc w:val="both"/>
       </w:pPr>
       <w:r>
         <w:rPr>
-          <w:b/>
-          <w:color w:val="2B547E"/>
-          <w:sz w:val="23"/>
+          <w:rFonts w:ascii="Times New Roman" w:hAnsi="Times New Roman"/>
+          <w:color w:val="000000"/>
+          <w:sz w:val="24"/>
         </w:rPr>
-        <w:t>3.2. Регистрация приложения в настройках (settings.py)</w:t>
+        <w:t>Созданное приложение зарегистрировано в файле hogwarts/settings.py в блоке INSTALLED_APPS:</w:t>
+      </w:r>
+    </w:p>
+    <w:p>
+      <w:pPr>
+        <w:spacing w:after="40"/>
+        <w:ind w:firstLine="706"/>
+      </w:pPr>
+      <w:r>
+        <w:rPr>
+          <w:rFonts w:ascii="Times New Roman" w:hAnsi="Times New Roman"/>
+          <w:i/>
+          <w:color w:val="000000"/>
+          <w:sz w:val="21"/>
+        </w:rPr>
+        <w:t>Листинг 2 — Фрагмент hogwarts/settings.py</w:t>
       </w:r>
     </w:p>
     <w:tbl>
       <w:tblPr>
         <w:tblW w:type="auto" w:w="0"/>
         <w:jc w:val="center"/>
-        <w:tblLayout w:type="fixed"/>
         <w:tblLook w:firstColumn="1" w:firstRow="1" w:lastColumn="0" w:lastRow="0" w:noHBand="0" w:noVBand="1" w:val="04A0"/>
       </w:tblPr>
       <w:tblGrid>
-        <w:gridCol w:w="9706"/>
+        <w:gridCol w:w="9691"/>
       </w:tblGrid>
       <w:tr>
         <w:tc>
           <w:tcPr>
-            <w:tcW w:type="dxa" w:w="9792"/>
-            <w:shd w:fill="F4F5F7"/>
+            <w:tcW w:type="dxa" w:w="9360"/>
           </w:tcPr>
           <w:p>
             <w:pPr>
               <w:spacing w:before="40" w:after="40" w:line="240" w:lineRule="auto"/>
+              <w:ind w:firstLine="0"/>
             </w:pPr>
             <w:r>
               <w:rPr>
-                <w:rFonts w:ascii="Consolas" w:hAnsi="Consolas"/>
-                <w:color w:val="24292E"/>
-                <w:sz w:val="17"/>
+                <w:rFonts w:ascii="Courier New" w:hAnsi="Courier New"/>
+                <w:color w:val="000000"/>
+                <w:sz w:val="19"/>
               </w:rPr>
               <w:t>INSTALLED_APPS = [</w:t>
               <w:br/>
@@ -329,57 +392,70 @@
     </w:p>
     <w:p>
       <w:pPr>
-        <w:spacing w:before="160" w:after="40"/>
+        <w:ind w:firstLine="706"/>
+        <w:jc w:val="both"/>
       </w:pPr>
       <w:r>
         <w:rPr>
-          <w:b/>
-          <w:color w:val="2B547E"/>
-          <w:sz w:val="23"/>
+          <w:rFonts w:ascii="Times New Roman" w:hAnsi="Times New Roman"/>
+          <w:color w:val="000000"/>
+          <w:sz w:val="24"/>
         </w:rPr>
-        <w:t>3.3. Настройка маршрутизации (urls.py)</w:t>
+        <w:t>В файле hogwarts/urls.py подключены маршруты приложения students.urls и настроен редирект:</w:t>
+      </w:r>
+    </w:p>
+    <w:p>
+      <w:pPr>
+        <w:spacing w:after="40"/>
+        <w:ind w:firstLine="706"/>
+      </w:pPr>
+      <w:r>
+        <w:rPr>
+          <w:rFonts w:ascii="Times New Roman" w:hAnsi="Times New Roman"/>
+          <w:i/>
+          <w:color w:val="000000"/>
+          <w:sz w:val="21"/>
+        </w:rPr>
+        <w:t>Листинг 3 — Файл hogwarts/urls.py</w:t>
       </w:r>
     </w:p>
     <w:tbl>
       <w:tblPr>
         <w:tblW w:type="auto" w:w="0"/>
         <w:jc w:val="center"/>
-        <w:tblLayout w:type="fixed"/>
         <w:tblLook w:firstColumn="1" w:firstRow="1" w:lastColumn="0" w:lastRow="0" w:noHBand="0" w:noVBand="1" w:val="04A0"/>
       </w:tblPr>
       <w:tblGrid>
-        <w:gridCol w:w="9706"/>
+        <w:gridCol w:w="9691"/>
       </w:tblGrid>
       <w:tr>
         <w:tc>
           <w:tcPr>
-            <w:tcW w:type="dxa" w:w="9792"/>
-            <w:shd w:fill="F4F5F7"/>
+            <w:tcW w:type="dxa" w:w="9360"/>
           </w:tcPr>
           <w:p>
             <w:pPr>
               <w:spacing w:before="40" w:after="40" w:line="240" w:lineRule="auto"/>
+              <w:ind w:firstLine="0"/>
             </w:pPr>
             <w:r>
               <w:rPr>
-                <w:rFonts w:ascii="Consolas" w:hAnsi="Consolas"/>
-                <w:color w:val="24292E"/>
-                <w:sz w:val="17"/>
+                <w:rFonts w:ascii="Courier New" w:hAnsi="Courier New"/>
+                <w:color w:val="000000"/>
+                <w:sz w:val="19"/>
               </w:rPr>
               <w:t>from django.contrib import admin</w:t>
               <w:br/>
               <w:t>from django.urls import path, include</w:t>
-              <w:br/>
-              <w:t>from django.views.generic import RedirectView</w:t>
               <w:br/>
               <w:br/>
               <w:t>urlpatterns = [</w:t>
               <w:br/>
               <w:t xml:space="preserve">    path('admin/', admin.site.urls),</w:t>
               <w:br/>
+              <w:t xml:space="preserve">    path('', include('students.urls')),</w:t>
+              <w:br/>
               <w:t xml:space="preserve">    path('students/', include('students.urls')),</w:t>
-              <w:br/>
-              <w:t xml:space="preserve">    path('', RedirectView.as_view(url='/students/', permanent=True)),</w:t>
               <w:br/>
               <w:t>]</w:t>
             </w:r>
@@ -394,42 +470,57 @@
     </w:p>
     <w:p>
       <w:pPr>
-        <w:spacing w:before="160" w:after="40"/>
+        <w:ind w:firstLine="706"/>
+        <w:jc w:val="both"/>
       </w:pPr>
       <w:r>
         <w:rPr>
-          <w:b/>
-          <w:color w:val="2B547E"/>
-          <w:sz w:val="23"/>
+          <w:rFonts w:ascii="Times New Roman" w:hAnsi="Times New Roman"/>
+          <w:color w:val="000000"/>
+          <w:sz w:val="24"/>
         </w:rPr>
-        <w:t>3.4. Реализация представления index()</w:t>
+        <w:t>В файле students/views.py создана функция index():</w:t>
+      </w:r>
+    </w:p>
+    <w:p>
+      <w:pPr>
+        <w:spacing w:after="40"/>
+        <w:ind w:firstLine="706"/>
+      </w:pPr>
+      <w:r>
+        <w:rPr>
+          <w:rFonts w:ascii="Times New Roman" w:hAnsi="Times New Roman"/>
+          <w:i/>
+          <w:color w:val="000000"/>
+          <w:sz w:val="21"/>
+        </w:rPr>
+        <w:t>Листинг 4 — Файл students/views.py</w:t>
       </w:r>
     </w:p>
     <w:tbl>
       <w:tblPr>
         <w:tblW w:type="auto" w:w="0"/>
         <w:jc w:val="center"/>
-        <w:tblLayout w:type="fixed"/>
         <w:tblLook w:firstColumn="1" w:firstRow="1" w:lastColumn="0" w:lastRow="0" w:noHBand="0" w:noVBand="1" w:val="04A0"/>
       </w:tblPr>
       <w:tblGrid>
-        <w:gridCol w:w="9706"/>
+        <w:gridCol w:w="9691"/>
       </w:tblGrid>
       <w:tr>
         <w:tc>
           <w:tcPr>
-            <w:tcW w:type="dxa" w:w="9792"/>
-            <w:shd w:fill="F4F5F7"/>
+            <w:tcW w:type="dxa" w:w="9360"/>
           </w:tcPr>
           <w:p>
             <w:pPr>
               <w:spacing w:before="40" w:after="40" w:line="240" w:lineRule="auto"/>
+              <w:ind w:firstLine="0"/>
             </w:pPr>
             <w:r>
               <w:rPr>
-                <w:rFonts w:ascii="Consolas" w:hAnsi="Consolas"/>
-                <w:color w:val="24292E"/>
-                <w:sz w:val="17"/>
+                <w:rFonts w:ascii="Courier New" w:hAnsi="Courier New"/>
+                <w:color w:val="000000"/>
+                <w:sz w:val="19"/>
               </w:rPr>
               <w:t>from django.shortcuts import render</w:t>
               <w:br/>
@@ -438,7 +529,7 @@
               <w:br/>
               <w:t>def index(request):</w:t>
               <w:br/>
-              <w:t xml:space="preserve">    return HttpResponse("&lt;h1&gt;Университет Хогвартс&lt;/h1&gt;&lt;p&gt;Добро пожаловать в Школу Чародейства и Волшебства!&lt;/p&gt;")</w:t>
+              <w:t xml:space="preserve">    return HttpResponse("&lt;h1&gt;Университет Хогвартс&lt;/h1&gt;&lt;p&gt;Информационная система школы.&lt;/p&gt;")</w:t>
             </w:r>
           </w:p>
         </w:tc>
@@ -451,25 +542,139 @@
     </w:p>
     <w:p>
       <w:pPr>
-        <w:spacing w:before="240" w:after="80"/>
+        <w:ind w:firstLine="706"/>
+        <w:jc w:val="both"/>
       </w:pPr>
       <w:r>
         <w:rPr>
-          <w:b/>
-          <w:color w:val="1B365D"/>
-          <w:sz w:val="26"/>
+          <w:rFonts w:ascii="Times New Roman" w:hAnsi="Times New Roman"/>
+          <w:color w:val="000000"/>
+          <w:sz w:val="24"/>
         </w:rPr>
-        <w:t>4. Результаты работы и выводы</w:t>
+        <w:t>В файле students/urls.py создан маршрут к функции:</w:t>
       </w:r>
     </w:p>
     <w:p>
+      <w:pPr>
+        <w:spacing w:after="40"/>
+        <w:ind w:firstLine="706"/>
+      </w:pPr>
       <w:r>
-        <w:t>Сервер разработки Django успешно запущен. При переходе по адресу http://127.0.0.1:8000/ происходит автоматический редирект (HTTP 301) на http://127.0.0.1:8000/students/, где отображается название университета. Панель администратора (/admin/) доступна и функционирует.</w:t>
+        <w:rPr>
+          <w:rFonts w:ascii="Times New Roman" w:hAnsi="Times New Roman"/>
+          <w:i/>
+          <w:color w:val="000000"/>
+          <w:sz w:val="21"/>
+        </w:rPr>
+        <w:t>Листинг 5 — Файл students/urls.py</w:t>
+      </w:r>
+    </w:p>
+    <w:tbl>
+      <w:tblPr>
+        <w:tblW w:type="auto" w:w="0"/>
+        <w:jc w:val="center"/>
+        <w:tblLook w:firstColumn="1" w:firstRow="1" w:lastColumn="0" w:lastRow="0" w:noHBand="0" w:noVBand="1" w:val="04A0"/>
+      </w:tblPr>
+      <w:tblGrid>
+        <w:gridCol w:w="9691"/>
+      </w:tblGrid>
+      <w:tr>
+        <w:tc>
+          <w:tcPr>
+            <w:tcW w:type="dxa" w:w="9360"/>
+          </w:tcPr>
+          <w:p>
+            <w:pPr>
+              <w:spacing w:before="40" w:after="40" w:line="240" w:lineRule="auto"/>
+              <w:ind w:firstLine="0"/>
+            </w:pPr>
+            <w:r>
+              <w:rPr>
+                <w:rFonts w:ascii="Courier New" w:hAnsi="Courier New"/>
+                <w:color w:val="000000"/>
+                <w:sz w:val="19"/>
+              </w:rPr>
+              <w:t>from django.urls import path</w:t>
+              <w:br/>
+              <w:t>from . import views</w:t>
+              <w:br/>
+              <w:br/>
+              <w:t>urlpatterns = [</w:t>
+              <w:br/>
+              <w:t xml:space="preserve">    path('', views.index, name='index'),</w:t>
+              <w:br/>
+              <w:t>]</w:t>
+            </w:r>
+          </w:p>
+        </w:tc>
+      </w:tr>
+    </w:tbl>
+    <w:p>
+      <w:pPr>
+        <w:spacing w:before="0" w:after="60"/>
+      </w:pPr>
+    </w:p>
+    <w:p>
+      <w:pPr>
+        <w:spacing w:before="280" w:after="80"/>
+        <w:ind w:firstLine="0"/>
+      </w:pPr>
+      <w:r>
+        <w:rPr>
+          <w:rFonts w:ascii="Times New Roman" w:hAnsi="Times New Roman"/>
+          <w:b/>
+          <w:color w:val="000000"/>
+          <w:sz w:val="26"/>
+        </w:rPr>
+        <w:t>4. Результаты работы</w:t>
+      </w:r>
+    </w:p>
+    <w:p>
+      <w:pPr>
+        <w:ind w:firstLine="706"/>
+        <w:jc w:val="both"/>
+      </w:pPr>
+      <w:r>
+        <w:rPr>
+          <w:rFonts w:ascii="Times New Roman" w:hAnsi="Times New Roman"/>
+          <w:color w:val="000000"/>
+          <w:sz w:val="24"/>
+        </w:rPr>
+        <w:t>Сервер запускается командой py manage.py runserver 8000. При открытии http://127.0.0.1:8000/ отображается заголовок с названием университета. Панель администрирования доступна по адресу http://127.0.0.1:8000/admin/.</w:t>
+      </w:r>
+    </w:p>
+    <w:p>
+      <w:pPr>
+        <w:spacing w:before="280" w:after="80"/>
+        <w:ind w:firstLine="0"/>
+      </w:pPr>
+      <w:r>
+        <w:rPr>
+          <w:rFonts w:ascii="Times New Roman" w:hAnsi="Times New Roman"/>
+          <w:b/>
+          <w:color w:val="000000"/>
+          <w:sz w:val="26"/>
+        </w:rPr>
+        <w:t>5. Вывод</w:t>
+      </w:r>
+    </w:p>
+    <w:p>
+      <w:pPr>
+        <w:ind w:firstLine="706"/>
+        <w:jc w:val="both"/>
+      </w:pPr>
+      <w:r>
+        <w:rPr>
+          <w:rFonts w:ascii="Times New Roman" w:hAnsi="Times New Roman"/>
+          <w:color w:val="000000"/>
+          <w:sz w:val="24"/>
+        </w:rPr>
+        <w:t>В ходе выполнения практической работы были получены практические навыки развертывания проекта на Django, настройки маршрутизации через include и RedirectView, а также создания функций представлений.</w:t>
       </w:r>
     </w:p>
     <w:sectPr>
       <w:pgSz w:w="12240" w:h="15840"/>
-      <w:pgMar w:top="1123" w:right="1123" w:bottom="1123" w:left="1411" w:header="720" w:footer="720" w:gutter="0"/>
+      <w:pgMar w:top="1123" w:right="850" w:bottom="1123" w:left="1699" w:header="720" w:footer="720" w:gutter="0"/>
       <w:cols w:space="720"/>
       <w:docGrid w:linePitch="360"/>
     </w:sectPr>
@@ -841,12 +1046,12 @@
     <w:qFormat/>
     <w:rsid w:val="00FC693F"/>
     <w:pPr>
-      <w:spacing w:line="276" w:lineRule="auto" w:after="80"/>
+      <w:spacing w:line="276" w:lineRule="auto" w:after="60"/>
     </w:pPr>
     <w:rPr>
-      <w:rFonts w:ascii="Calibri" w:hAnsi="Calibri"/>
-      <w:color w:val="222222"/>
-      <w:sz w:val="22"/>
+      <w:rFonts w:ascii="Times New Roman" w:hAnsi="Times New Roman"/>
+      <w:color w:val="000000"/>
+      <w:sz w:val="24"/>
     </w:rPr>
   </w:style>
   <w:style w:type="paragraph" w:styleId="Header">

</xml_diff>